<commit_message>
fix: replace 3 electrobezopasnost questions in tickets 6,10,14
- T6Q20: replaced, key A (nominal size)
- T10Q12: replaced, key B (acceptance document)
- T14Q9: replaced, key D (eccentricity defect)
- Regenerated 05-2
</commit_message>
<xml_diff>
--- a/Оператор автоматических и полуавтоматических станков и линий станков/профессиональной переподготовки 15474 Оператор станков/05-2. ПО_ПП_ФОС_Оператор станков_2-3_разр.docx
+++ b/Оператор автоматических и полуавтоматических станков и линий станков/профессиональной переподготовки 15474 Оператор станков/05-2. ПО_ПП_ФОС_Оператор станков_2-3_разр.docx
@@ -5381,59 +5381,59 @@
           <w:b/>
           <w:sz w:val="28"/>
         </w:rPr>
-        <w:t>20. Какая группа по электробезопасности необходима оператору станка для самостоятельной работы с электрооборудованием?</w:t>
-      </w:r>
-    </w:p>
-    <w:p>
-      <w:pPr>
-        <w:ind w:left="567"/>
-      </w:pPr>
-      <w:r>
-        <w:rPr>
-          <w:rFonts w:ascii="Times New Roman" w:hAnsi="Times New Roman"/>
-          <w:b/>
-          <w:sz w:val="28"/>
-        </w:rPr>
-        <w:t>а) II группа;</w:t>
-      </w:r>
-    </w:p>
-    <w:p>
-      <w:pPr>
-        <w:ind w:left="567"/>
-      </w:pPr>
-      <w:r>
-        <w:rPr>
-          <w:rFonts w:ascii="Times New Roman" w:hAnsi="Times New Roman"/>
-          <w:b/>
-          <w:sz w:val="28"/>
-        </w:rPr>
-        <w:t>б) I группа;</w:t>
-      </w:r>
-    </w:p>
-    <w:p>
-      <w:pPr>
-        <w:ind w:left="567"/>
-      </w:pPr>
-      <w:r>
-        <w:rPr>
-          <w:rFonts w:ascii="Times New Roman" w:hAnsi="Times New Roman"/>
-          <w:b/>
-          <w:sz w:val="28"/>
-        </w:rPr>
-        <w:t>в) III группа;</w:t>
-      </w:r>
-    </w:p>
-    <w:p>
-      <w:pPr>
-        <w:ind w:left="567"/>
-      </w:pPr>
-      <w:r>
-        <w:rPr>
-          <w:rFonts w:ascii="Times New Roman" w:hAnsi="Times New Roman"/>
-          <w:b/>
-          <w:sz w:val="28"/>
-        </w:rPr>
-        <w:t>г) IV группа.</w:t>
+        <w:t>20. Какой размер заготовки называется номинальным?</w:t>
+      </w:r>
+    </w:p>
+    <w:p>
+      <w:pPr>
+        <w:ind w:left="567"/>
+      </w:pPr>
+      <w:r>
+        <w:rPr>
+          <w:rFonts w:ascii="Times New Roman" w:hAnsi="Times New Roman"/>
+          <w:b/>
+          <w:sz w:val="28"/>
+        </w:rPr>
+        <w:t>а) Размер, относительно которого определяются предельные отклонения;</w:t>
+      </w:r>
+    </w:p>
+    <w:p>
+      <w:pPr>
+        <w:ind w:left="567"/>
+      </w:pPr>
+      <w:r>
+        <w:rPr>
+          <w:rFonts w:ascii="Times New Roman" w:hAnsi="Times New Roman"/>
+          <w:b/>
+          <w:sz w:val="28"/>
+        </w:rPr>
+        <w:t>б) Наибольший допустимый размер детали;</w:t>
+      </w:r>
+    </w:p>
+    <w:p>
+      <w:pPr>
+        <w:ind w:left="567"/>
+      </w:pPr>
+      <w:r>
+        <w:rPr>
+          <w:rFonts w:ascii="Times New Roman" w:hAnsi="Times New Roman"/>
+          <w:b/>
+          <w:sz w:val="28"/>
+        </w:rPr>
+        <w:t>в) Размер, полученный после измерения;</w:t>
+      </w:r>
+    </w:p>
+    <w:p>
+      <w:pPr>
+        <w:ind w:left="567"/>
+      </w:pPr>
+      <w:r>
+        <w:rPr>
+          <w:rFonts w:ascii="Times New Roman" w:hAnsi="Times New Roman"/>
+          <w:b/>
+          <w:sz w:val="28"/>
+        </w:rPr>
+        <w:t>г) Наименьший допустимый размер детали.</w:t>
       </w:r>
     </w:p>
     <w:p/>

</xml_diff>